<commit_message>
antes de correccion tesis
</commit_message>
<xml_diff>
--- a/ANTENAS Y PROPAGACIÓN/AAA CARATULEX grupal.docx
+++ b/ANTENAS Y PROPAGACIÓN/AAA CARATULEX grupal.docx
@@ -394,6 +394,14 @@
         <w:jc w:val="center"/>
       </w:pPr>
       <w:r>
+        <w:t>GRACIA GUATO FELIX RAFAEL</w:t>
+      </w:r>
+    </w:p>
+    <w:p>
+      <w:pPr>
+        <w:jc w:val="center"/>
+      </w:pPr>
+      <w:r>
         <w:t>MORALES COBEÑA MIYAKO KUSHIRO</w:t>
       </w:r>
     </w:p>
@@ -401,11 +409,9 @@
       <w:pPr>
         <w:jc w:val="center"/>
       </w:pPr>
-    </w:p>
-    <w:p>
-      <w:pPr>
-        <w:jc w:val="center"/>
-      </w:pPr>
+      <w:r>
+        <w:t>ZARSOZA VERA KELLY MELISSA</w:t>
+      </w:r>
     </w:p>
     <w:p>
       <w:pPr>
@@ -512,7 +518,7 @@
     </w:p>
     <w:p>
       <w:r>
-        <w:t>QUEVEDO, ECUADOR                                                                     19 DE MAY. DE 25</w:t>
+        <w:t>QUEVEDO, ECUADOR                                                                     29 DE JUN. DE 25</w:t>
       </w:r>
     </w:p>
     <w:p/>
@@ -1359,6 +1365,25 @@
 </file>
 
 <file path=customXml/item1.xml><?xml version="1.0" encoding="utf-8"?>
+<?mso-contentType ?>
+<FormTemplates xmlns="http://schemas.microsoft.com/sharepoint/v3/contenttype/forms">
+  <Display>DocumentLibraryForm</Display>
+  <Edit>DocumentLibraryForm</Edit>
+  <New>DocumentLibraryForm</New>
+</FormTemplates>
+</file>
+
+<file path=customXml/item2.xml><?xml version="1.0" encoding="utf-8"?>
+<p:properties xmlns:p="http://schemas.microsoft.com/office/2006/metadata/properties" xmlns:xsi="http://www.w3.org/2001/XMLSchema-instance" xmlns:pc="http://schemas.microsoft.com/office/infopath/2007/PartnerControls">
+  <documentManagement/>
+</p:properties>
+</file>
+
+<file path=customXml/item3.xml><?xml version="1.0" encoding="utf-8"?>
+<b:Sources xmlns:b="http://schemas.openxmlformats.org/officeDocument/2006/bibliography" xmlns="http://schemas.openxmlformats.org/officeDocument/2006/bibliography" SelectedStyle="\APASixthEditionOfficeOnline.xsl" StyleName="APA" Version="6"/>
+</file>
+
+<file path=customXml/item4.xml><?xml version="1.0" encoding="utf-8"?>
 <ct:contentTypeSchema xmlns:ct="http://schemas.microsoft.com/office/2006/metadata/contentType" xmlns:ma="http://schemas.microsoft.com/office/2006/metadata/properties/metaAttributes" ct:_="" ma:_="" ma:contentTypeName="Documento" ma:contentTypeID="0x010100A5C0487A85234041ABCC04D606B0D680" ma:contentTypeVersion="13" ma:contentTypeDescription="Crear nuevo documento." ma:contentTypeScope="" ma:versionID="6cfa88a6c60d194070a270eb62a21b24">
   <xsd:schema xmlns:xsd="http://www.w3.org/2001/XMLSchema" xmlns:xs="http://www.w3.org/2001/XMLSchema" xmlns:p="http://schemas.microsoft.com/office/2006/metadata/properties" xmlns:ns3="412e5359-321c-4749-b6c6-497cf934ab24" targetNamespace="http://schemas.microsoft.com/office/2006/metadata/properties" ma:root="true" ma:fieldsID="395a25b24f05dd036ecc9c98436a574a" ns3:_="">
     <xsd:import namespace="412e5359-321c-4749-b6c6-497cf934ab24"/>
@@ -1560,26 +1585,32 @@
 </ct:contentTypeSchema>
 </file>
 
-<file path=customXml/item2.xml><?xml version="1.0" encoding="utf-8"?>
-<b:Sources xmlns:b="http://schemas.openxmlformats.org/officeDocument/2006/bibliography" xmlns="http://schemas.openxmlformats.org/officeDocument/2006/bibliography" SelectedStyle="\APASixthEditionOfficeOnline.xsl" StyleName="APA" Version="6"/>
+<file path=customXml/itemProps1.xml><?xml version="1.0" encoding="utf-8"?>
+<ds:datastoreItem xmlns:ds="http://schemas.openxmlformats.org/officeDocument/2006/customXml" ds:itemID="{85BFE6E4-4CB5-4366-AD67-3CEFCBC6D1DB}">
+  <ds:schemaRefs>
+    <ds:schemaRef ds:uri="http://schemas.microsoft.com/sharepoint/v3/contenttype/forms"/>
+  </ds:schemaRefs>
+</ds:datastoreItem>
 </file>
 
-<file path=customXml/item3.xml><?xml version="1.0" encoding="utf-8"?>
-<p:properties xmlns:p="http://schemas.microsoft.com/office/2006/metadata/properties" xmlns:xsi="http://www.w3.org/2001/XMLSchema-instance" xmlns:pc="http://schemas.microsoft.com/office/infopath/2007/PartnerControls">
-  <documentManagement/>
-</p:properties>
+<file path=customXml/itemProps2.xml><?xml version="1.0" encoding="utf-8"?>
+<ds:datastoreItem xmlns:ds="http://schemas.openxmlformats.org/officeDocument/2006/customXml" ds:itemID="{A6B2191B-6C12-404F-B60B-5F9BE9C84421}">
+  <ds:schemaRefs>
+    <ds:schemaRef ds:uri="http://schemas.microsoft.com/office/2006/metadata/properties"/>
+    <ds:schemaRef ds:uri="http://schemas.microsoft.com/office/infopath/2007/PartnerControls"/>
+  </ds:schemaRefs>
+</ds:datastoreItem>
 </file>
 
-<file path=customXml/item4.xml><?xml version="1.0" encoding="utf-8"?>
-<?mso-contentType ?>
-<FormTemplates xmlns="http://schemas.microsoft.com/sharepoint/v3/contenttype/forms">
-  <Display>DocumentLibraryForm</Display>
-  <Edit>DocumentLibraryForm</Edit>
-  <New>DocumentLibraryForm</New>
-</FormTemplates>
+<file path=customXml/itemProps3.xml><?xml version="1.0" encoding="utf-8"?>
+<ds:datastoreItem xmlns:ds="http://schemas.openxmlformats.org/officeDocument/2006/customXml" ds:itemID="{08F8AE20-8A1E-411A-B97B-F8C6621176DC}">
+  <ds:schemaRefs>
+    <ds:schemaRef ds:uri="http://schemas.openxmlformats.org/officeDocument/2006/bibliography"/>
+  </ds:schemaRefs>
+</ds:datastoreItem>
 </file>
 
-<file path=customXml/itemProps1.xml><?xml version="1.0" encoding="utf-8"?>
+<file path=customXml/itemProps4.xml><?xml version="1.0" encoding="utf-8"?>
 <ds:datastoreItem xmlns:ds="http://schemas.openxmlformats.org/officeDocument/2006/customXml" ds:itemID="{E38F9A63-9EE7-49F9-A03D-95296C6DD05A}">
   <ds:schemaRefs>
     <ds:schemaRef ds:uri="http://schemas.microsoft.com/office/2006/metadata/contentType"/>
@@ -1595,29 +1626,4 @@
     <ds:schemaRef ds:uri="http://schemas.microsoft.com/internal/obd"/>
   </ds:schemaRefs>
 </ds:datastoreItem>
-</file>
-
-<file path=customXml/itemProps2.xml><?xml version="1.0" encoding="utf-8"?>
-<ds:datastoreItem xmlns:ds="http://schemas.openxmlformats.org/officeDocument/2006/customXml" ds:itemID="{08F8AE20-8A1E-411A-B97B-F8C6621176DC}">
-  <ds:schemaRefs>
-    <ds:schemaRef ds:uri="http://schemas.openxmlformats.org/officeDocument/2006/bibliography"/>
-  </ds:schemaRefs>
-</ds:datastoreItem>
-</file>
-
-<file path=customXml/itemProps3.xml><?xml version="1.0" encoding="utf-8"?>
-<ds:datastoreItem xmlns:ds="http://schemas.openxmlformats.org/officeDocument/2006/customXml" ds:itemID="{A6B2191B-6C12-404F-B60B-5F9BE9C84421}">
-  <ds:schemaRefs>
-    <ds:schemaRef ds:uri="http://schemas.microsoft.com/office/2006/metadata/properties"/>
-    <ds:schemaRef ds:uri="http://schemas.microsoft.com/office/infopath/2007/PartnerControls"/>
-  </ds:schemaRefs>
-</ds:datastoreItem>
-</file>
-
-<file path=customXml/itemProps4.xml><?xml version="1.0" encoding="utf-8"?>
-<ds:datastoreItem xmlns:ds="http://schemas.openxmlformats.org/officeDocument/2006/customXml" ds:itemID="{85BFE6E4-4CB5-4366-AD67-3CEFCBC6D1DB}">
-  <ds:schemaRefs>
-    <ds:schemaRef ds:uri="http://schemas.microsoft.com/sharepoint/v3/contenttype/forms"/>
-  </ds:schemaRefs>
-</ds:datastoreItem>
 </file>
</xml_diff>